<commit_message>
Name tags: 박정환 -> Hiếu, 원혜진 -> Hiền
Co-Authored-By: Claude Sonnet 5.5 <noreply@anthropic.com>
Claude-Session: https://claude.ai/code/session_01EMYMDrRc1h5sANjA4pYFaR
</commit_message>
<xml_diff>
--- a/명찰_v2.docx
+++ b/명찰_v2.docx
@@ -356,7 +356,7 @@
                 <w:sz w:val="88"/>
                 <w:szCs w:val="88"/>
               </w:rPr>
-              <w:t xml:space="preserve">Chinh Hoan</w:t>
+              <w:t xml:space="preserve">Hiếu</w:t>
             </w:r>
           </w:p>
           <w:p>
@@ -404,7 +404,7 @@
                 <w:sz w:val="88"/>
                 <w:szCs w:val="88"/>
               </w:rPr>
-              <w:t xml:space="preserve">Huệ Trân</w:t>
+              <w:t xml:space="preserve">Hiền</w:t>
             </w:r>
           </w:p>
           <w:p>

</xml_diff>

<commit_message>
Name tags: 이제희 -> Thiên Hy, 한도희 -> Đạo
Co-Authored-By: Claude Sonnet 5.5 <noreply@anthropic.com>
Claude-Session: https://claude.ai/code/session_01EMYMDrRc1h5sANjA4pYFaR
</commit_message>
<xml_diff>
--- a/명찰_v2.docx
+++ b/명찰_v2.docx
@@ -848,7 +848,7 @@
                 <w:sz w:val="88"/>
                 <w:szCs w:val="88"/>
               </w:rPr>
-              <w:t xml:space="preserve">Thiên Vy</w:t>
+              <w:t xml:space="preserve">Thiên Hy</w:t>
             </w:r>
           </w:p>
           <w:p>
@@ -1088,7 +1088,7 @@
                 <w:sz w:val="88"/>
                 <w:szCs w:val="88"/>
               </w:rPr>
-              <w:t xml:space="preserve">Tươi</w:t>
+              <w:t xml:space="preserve">Đạo</w:t>
             </w:r>
           </w:p>
           <w:p>

</xml_diff>

<commit_message>
Name tags: add 유계화 (Hoa)
Co-Authored-By: Claude Sonnet 5.5 <noreply@anthropic.com>
Claude-Session: https://claude.ai/code/session_01EMYMDrRc1h5sANjA4pYFaR
</commit_message>
<xml_diff>
--- a/명찰_v2.docx
+++ b/명찰_v2.docx
@@ -1238,6 +1238,54 @@
                 <w:sz w:val="88"/>
                 <w:szCs w:val="88"/>
               </w:rPr>
+              <w:t xml:space="preserve">Hoa</w:t>
+            </w:r>
+          </w:p>
+          <w:p>
+            <w:pPr>
+              <w:jc w:val="center"/>
+            </w:pPr>
+            <w:r>
+              <w:rPr>
+                <w:rFonts w:ascii="Malgun Gothic" w:cs="Malgun Gothic" w:eastAsia="Malgun Gothic" w:hAnsi="Malgun Gothic"/>
+                <w:color w:val="444444"/>
+                <w:sz w:val="26"/>
+                <w:szCs w:val="26"/>
+              </w:rPr>
+              <w:t xml:space="preserve">유계화</w:t>
+            </w:r>
+          </w:p>
+        </w:tc>
+        <w:tc>
+          <w:tcPr>
+            <w:tcW w:type="dxa" w:w="5102"/>
+            <w:tcBorders>
+              <w:top w:val="single" w:color="999999" w:sz="4"/>
+              <w:left w:val="single" w:color="999999" w:sz="4"/>
+              <w:bottom w:val="single" w:color="999999" w:sz="4"/>
+              <w:right w:val="single" w:color="999999" w:sz="4"/>
+            </w:tcBorders>
+            <w:tcMar>
+              <w:top w:type="dxa" w:w="60"/>
+              <w:left w:type="dxa" w:w="100"/>
+              <w:bottom w:type="dxa" w:w="60"/>
+              <w:right w:type="dxa" w:w="100"/>
+            </w:tcMar>
+            <w:vAlign w:val="center"/>
+          </w:tcPr>
+          <w:p>
+            <w:pPr>
+              <w:spacing w:after="120"/>
+              <w:jc w:val="center"/>
+            </w:pPr>
+            <w:r>
+              <w:rPr>
+                <w:rFonts w:ascii="Arial" w:cs="Arial" w:eastAsia="Arial" w:hAnsi="Arial"/>
+                <w:b/>
+                <w:bCs/>
+                <w:sz w:val="88"/>
+                <w:szCs w:val="88"/>
+              </w:rPr>
               <w:t xml:space="preserve">Lam Phong</w:t>
             </w:r>
           </w:p>
@@ -1253,54 +1301,6 @@
                 <w:szCs w:val="26"/>
               </w:rPr>
               <w:t xml:space="preserve">최찬호</w:t>
-            </w:r>
-          </w:p>
-        </w:tc>
-        <w:tc>
-          <w:tcPr>
-            <w:tcW w:type="dxa" w:w="5102"/>
-            <w:tcBorders>
-              <w:top w:val="single" w:color="999999" w:sz="4"/>
-              <w:left w:val="single" w:color="999999" w:sz="4"/>
-              <w:bottom w:val="single" w:color="999999" w:sz="4"/>
-              <w:right w:val="single" w:color="999999" w:sz="4"/>
-            </w:tcBorders>
-            <w:tcMar>
-              <w:top w:type="dxa" w:w="60"/>
-              <w:left w:type="dxa" w:w="100"/>
-              <w:bottom w:type="dxa" w:w="60"/>
-              <w:right w:type="dxa" w:w="100"/>
-            </w:tcMar>
-            <w:vAlign w:val="center"/>
-          </w:tcPr>
-          <w:p>
-            <w:pPr>
-              <w:spacing w:after="120"/>
-              <w:jc w:val="center"/>
-            </w:pPr>
-            <w:r>
-              <w:rPr>
-                <w:rFonts w:ascii="Arial" w:cs="Arial" w:eastAsia="Arial" w:hAnsi="Arial"/>
-                <w:b/>
-                <w:bCs/>
-                <w:sz w:val="88"/>
-                <w:szCs w:val="88"/>
-              </w:rPr>
-              <w:t xml:space="preserve">Mỹ Duyên</w:t>
-            </w:r>
-          </w:p>
-          <w:p>
-            <w:pPr>
-              <w:jc w:val="center"/>
-            </w:pPr>
-            <w:r>
-              <w:rPr>
-                <w:rFonts w:ascii="Malgun Gothic" w:cs="Malgun Gothic" w:eastAsia="Malgun Gothic" w:hAnsi="Malgun Gothic"/>
-                <w:color w:val="444444"/>
-                <w:sz w:val="26"/>
-                <w:szCs w:val="26"/>
-              </w:rPr>
-              <w:t xml:space="preserve">이재순</w:t>
             </w:r>
           </w:p>
         </w:tc>
@@ -1340,6 +1340,54 @@
                 <w:sz w:val="88"/>
                 <w:szCs w:val="88"/>
               </w:rPr>
+              <w:t xml:space="preserve">Mỹ Duyên</w:t>
+            </w:r>
+          </w:p>
+          <w:p>
+            <w:pPr>
+              <w:jc w:val="center"/>
+            </w:pPr>
+            <w:r>
+              <w:rPr>
+                <w:rFonts w:ascii="Malgun Gothic" w:cs="Malgun Gothic" w:eastAsia="Malgun Gothic" w:hAnsi="Malgun Gothic"/>
+                <w:color w:val="444444"/>
+                <w:sz w:val="26"/>
+                <w:szCs w:val="26"/>
+              </w:rPr>
+              <w:t xml:space="preserve">이재순</w:t>
+            </w:r>
+          </w:p>
+        </w:tc>
+        <w:tc>
+          <w:tcPr>
+            <w:tcW w:type="dxa" w:w="5102"/>
+            <w:tcBorders>
+              <w:top w:val="single" w:color="999999" w:sz="4"/>
+              <w:left w:val="single" w:color="999999" w:sz="4"/>
+              <w:bottom w:val="single" w:color="999999" w:sz="4"/>
+              <w:right w:val="single" w:color="999999" w:sz="4"/>
+            </w:tcBorders>
+            <w:tcMar>
+              <w:top w:type="dxa" w:w="60"/>
+              <w:left w:type="dxa" w:w="100"/>
+              <w:bottom w:type="dxa" w:w="60"/>
+              <w:right w:type="dxa" w:w="100"/>
+            </w:tcMar>
+            <w:vAlign w:val="center"/>
+          </w:tcPr>
+          <w:p>
+            <w:pPr>
+              <w:spacing w:after="120"/>
+              <w:jc w:val="center"/>
+            </w:pPr>
+            <w:r>
+              <w:rPr>
+                <w:rFonts w:ascii="Arial" w:cs="Arial" w:eastAsia="Arial" w:hAnsi="Arial"/>
+                <w:b/>
+                <w:bCs/>
+                <w:sz w:val="88"/>
+                <w:szCs w:val="88"/>
+              </w:rPr>
               <w:t xml:space="preserve">Dương Bình</w:t>
             </w:r>
           </w:p>
@@ -1403,54 +1451,6 @@
                 <w:szCs w:val="26"/>
               </w:rPr>
               <w:t xml:space="preserve">김수민</w:t>
-            </w:r>
-          </w:p>
-        </w:tc>
-        <w:tc>
-          <w:tcPr>
-            <w:tcW w:type="dxa" w:w="5102"/>
-            <w:tcBorders>
-              <w:top w:val="single" w:color="999999" w:sz="4"/>
-              <w:left w:val="single" w:color="999999" w:sz="4"/>
-              <w:bottom w:val="single" w:color="999999" w:sz="4"/>
-              <w:right w:val="single" w:color="999999" w:sz="4"/>
-            </w:tcBorders>
-            <w:tcMar>
-              <w:top w:type="dxa" w:w="60"/>
-              <w:left w:type="dxa" w:w="100"/>
-              <w:bottom w:type="dxa" w:w="60"/>
-              <w:right w:type="dxa" w:w="100"/>
-            </w:tcMar>
-            <w:vAlign w:val="center"/>
-          </w:tcPr>
-          <w:p>
-            <w:pPr>
-              <w:spacing w:after="120"/>
-              <w:jc w:val="center"/>
-            </w:pPr>
-            <w:r>
-              <w:rPr>
-                <w:rFonts w:ascii="Arial" w:cs="Arial" w:eastAsia="Arial" w:hAnsi="Arial"/>
-                <w:b/>
-                <w:bCs/>
-                <w:sz w:val="88"/>
-                <w:szCs w:val="88"/>
-              </w:rPr>
-              <w:t xml:space="preserve">Trang Thanh</w:t>
-            </w:r>
-          </w:p>
-          <w:p>
-            <w:pPr>
-              <w:jc w:val="center"/>
-            </w:pPr>
-            <w:r>
-              <w:rPr>
-                <w:rFonts w:ascii="Malgun Gothic" w:cs="Malgun Gothic" w:eastAsia="Malgun Gothic" w:hAnsi="Malgun Gothic"/>
-                <w:color w:val="444444"/>
-                <w:sz w:val="26"/>
-                <w:szCs w:val="26"/>
-              </w:rPr>
-              <w:t xml:space="preserve">김예나</w:t>
             </w:r>
           </w:p>
         </w:tc>
@@ -1532,6 +1532,54 @@
                 <w:sz w:val="88"/>
                 <w:szCs w:val="88"/>
               </w:rPr>
+              <w:t xml:space="preserve">Trang Thanh</w:t>
+            </w:r>
+          </w:p>
+          <w:p>
+            <w:pPr>
+              <w:jc w:val="center"/>
+            </w:pPr>
+            <w:r>
+              <w:rPr>
+                <w:rFonts w:ascii="Malgun Gothic" w:cs="Malgun Gothic" w:eastAsia="Malgun Gothic" w:hAnsi="Malgun Gothic"/>
+                <w:color w:val="444444"/>
+                <w:sz w:val="26"/>
+                <w:szCs w:val="26"/>
+              </w:rPr>
+              <w:t xml:space="preserve">김예나</w:t>
+            </w:r>
+          </w:p>
+        </w:tc>
+        <w:tc>
+          <w:tcPr>
+            <w:tcW w:type="dxa" w:w="5102"/>
+            <w:tcBorders>
+              <w:top w:val="single" w:color="999999" w:sz="4"/>
+              <w:left w:val="single" w:color="999999" w:sz="4"/>
+              <w:bottom w:val="single" w:color="999999" w:sz="4"/>
+              <w:right w:val="single" w:color="999999" w:sz="4"/>
+            </w:tcBorders>
+            <w:tcMar>
+              <w:top w:type="dxa" w:w="60"/>
+              <w:left w:type="dxa" w:w="100"/>
+              <w:bottom w:type="dxa" w:w="60"/>
+              <w:right w:type="dxa" w:w="100"/>
+            </w:tcMar>
+            <w:vAlign w:val="center"/>
+          </w:tcPr>
+          <w:p>
+            <w:pPr>
+              <w:spacing w:after="120"/>
+              <w:jc w:val="center"/>
+            </w:pPr>
+            <w:r>
+              <w:rPr>
+                <w:rFonts w:ascii="Arial" w:cs="Arial" w:eastAsia="Arial" w:hAnsi="Arial"/>
+                <w:b/>
+                <w:bCs/>
+                <w:sz w:val="88"/>
+                <w:szCs w:val="88"/>
+              </w:rPr>
               <w:t xml:space="preserve">Ngọc Mai</w:t>
             </w:r>
           </w:p>
@@ -1595,54 +1643,6 @@
                 <w:szCs w:val="26"/>
               </w:rPr>
               <w:t xml:space="preserve">김소영</w:t>
-            </w:r>
-          </w:p>
-        </w:tc>
-        <w:tc>
-          <w:tcPr>
-            <w:tcW w:type="dxa" w:w="5102"/>
-            <w:tcBorders>
-              <w:top w:val="single" w:color="999999" w:sz="4"/>
-              <w:left w:val="single" w:color="999999" w:sz="4"/>
-              <w:bottom w:val="single" w:color="999999" w:sz="4"/>
-              <w:right w:val="single" w:color="999999" w:sz="4"/>
-            </w:tcBorders>
-            <w:tcMar>
-              <w:top w:type="dxa" w:w="60"/>
-              <w:left w:type="dxa" w:w="100"/>
-              <w:bottom w:type="dxa" w:w="60"/>
-              <w:right w:type="dxa" w:w="100"/>
-            </w:tcMar>
-            <w:vAlign w:val="center"/>
-          </w:tcPr>
-          <w:p>
-            <w:pPr>
-              <w:spacing w:after="120"/>
-              <w:jc w:val="center"/>
-            </w:pPr>
-            <w:r>
-              <w:rPr>
-                <w:rFonts w:ascii="Arial" w:cs="Arial" w:eastAsia="Arial" w:hAnsi="Arial"/>
-                <w:b/>
-                <w:bCs/>
-                <w:sz w:val="88"/>
-                <w:szCs w:val="88"/>
-              </w:rPr>
-              <w:t xml:space="preserve">Minh Trường</w:t>
-            </w:r>
-          </w:p>
-          <w:p>
-            <w:pPr>
-              <w:jc w:val="center"/>
-            </w:pPr>
-            <w:r>
-              <w:rPr>
-                <w:rFonts w:ascii="Malgun Gothic" w:cs="Malgun Gothic" w:eastAsia="Malgun Gothic" w:hAnsi="Malgun Gothic"/>
-                <w:color w:val="444444"/>
-                <w:sz w:val="26"/>
-                <w:szCs w:val="26"/>
-              </w:rPr>
-              <w:t xml:space="preserve">김종현</w:t>
             </w:r>
           </w:p>
         </w:tc>
@@ -1682,6 +1682,54 @@
                 <w:sz w:val="88"/>
                 <w:szCs w:val="88"/>
               </w:rPr>
+              <w:t xml:space="preserve">Minh Trường</w:t>
+            </w:r>
+          </w:p>
+          <w:p>
+            <w:pPr>
+              <w:jc w:val="center"/>
+            </w:pPr>
+            <w:r>
+              <w:rPr>
+                <w:rFonts w:ascii="Malgun Gothic" w:cs="Malgun Gothic" w:eastAsia="Malgun Gothic" w:hAnsi="Malgun Gothic"/>
+                <w:color w:val="444444"/>
+                <w:sz w:val="26"/>
+                <w:szCs w:val="26"/>
+              </w:rPr>
+              <w:t xml:space="preserve">김종현</w:t>
+            </w:r>
+          </w:p>
+        </w:tc>
+        <w:tc>
+          <w:tcPr>
+            <w:tcW w:type="dxa" w:w="5102"/>
+            <w:tcBorders>
+              <w:top w:val="single" w:color="999999" w:sz="4"/>
+              <w:left w:val="single" w:color="999999" w:sz="4"/>
+              <w:bottom w:val="single" w:color="999999" w:sz="4"/>
+              <w:right w:val="single" w:color="999999" w:sz="4"/>
+            </w:tcBorders>
+            <w:tcMar>
+              <w:top w:type="dxa" w:w="60"/>
+              <w:left w:type="dxa" w:w="100"/>
+              <w:bottom w:type="dxa" w:w="60"/>
+              <w:right w:type="dxa" w:w="100"/>
+            </w:tcMar>
+            <w:vAlign w:val="center"/>
+          </w:tcPr>
+          <w:p>
+            <w:pPr>
+              <w:spacing w:after="120"/>
+              <w:jc w:val="center"/>
+            </w:pPr>
+            <w:r>
+              <w:rPr>
+                <w:rFonts w:ascii="Arial" w:cs="Arial" w:eastAsia="Arial" w:hAnsi="Arial"/>
+                <w:b/>
+                <w:bCs/>
+                <w:sz w:val="88"/>
+                <w:szCs w:val="88"/>
+              </w:rPr>
               <w:t xml:space="preserve">Huấn</w:t>
             </w:r>
           </w:p>
@@ -1748,6 +1796,12 @@
             </w:r>
           </w:p>
         </w:tc>
+      </w:tr>
+      <w:tr>
+        <w:trPr>
+          <w:cantSplit/>
+          <w:trHeight w:val="3402" w:hRule="exact"/>
+        </w:trPr>
         <w:tc>
           <w:tcPr>
             <w:tcW w:type="dxa" w:w="5102"/>
@@ -1795,6 +1849,44 @@
               <w:t xml:space="preserve">이주복</w:t>
             </w:r>
           </w:p>
+        </w:tc>
+        <w:tc>
+          <w:tcPr>
+            <w:tcW w:type="dxa" w:w="5102"/>
+            <w:tcBorders>
+              <w:top w:val="single" w:color="999999" w:sz="4"/>
+              <w:left w:val="single" w:color="999999" w:sz="4"/>
+              <w:bottom w:val="single" w:color="999999" w:sz="4"/>
+              <w:right w:val="single" w:color="999999" w:sz="4"/>
+            </w:tcBorders>
+            <w:tcMar>
+              <w:top w:type="dxa" w:w="60"/>
+              <w:left w:type="dxa" w:w="100"/>
+              <w:bottom w:type="dxa" w:w="60"/>
+              <w:right w:type="dxa" w:w="100"/>
+            </w:tcMar>
+            <w:vAlign w:val="center"/>
+          </w:tcPr>
+          <w:p/>
+        </w:tc>
+        <w:tc>
+          <w:tcPr>
+            <w:tcW w:type="dxa" w:w="5102"/>
+            <w:tcBorders>
+              <w:top w:val="single" w:color="999999" w:sz="4"/>
+              <w:left w:val="single" w:color="999999" w:sz="4"/>
+              <w:bottom w:val="single" w:color="999999" w:sz="4"/>
+              <w:right w:val="single" w:color="999999" w:sz="4"/>
+            </w:tcBorders>
+            <w:tcMar>
+              <w:top w:type="dxa" w:w="60"/>
+              <w:left w:type="dxa" w:w="100"/>
+              <w:bottom w:type="dxa" w:w="60"/>
+              <w:right w:type="dxa" w:w="100"/>
+            </w:tcMar>
+            <w:vAlign w:val="center"/>
+          </w:tcPr>
+          <w:p/>
         </w:tc>
       </w:tr>
     </w:tbl>

</xml_diff>

<commit_message>
Name tags: 박철현 -> Triết Hiến, 한상현 -> Huy
Co-Authored-By: Claude Sonnet 5.5 <noreply@anthropic.com>
Claude-Session: https://claude.ai/code/session_01EMYMDrRc1h5sANjA4pYFaR
</commit_message>
<xml_diff>
--- a/명찰_v2.docx
+++ b/명찰_v2.docx
@@ -548,7 +548,7 @@
                 <w:sz w:val="88"/>
                 <w:szCs w:val="88"/>
               </w:rPr>
-              <w:t xml:space="preserve">Triết Hiền</w:t>
+              <w:t xml:space="preserve">Triết Hiến</w:t>
             </w:r>
           </w:p>
           <w:p>
@@ -1040,7 +1040,7 @@
                 <w:sz w:val="88"/>
                 <w:szCs w:val="88"/>
               </w:rPr>
-              <w:t xml:space="preserve">Huyền</w:t>
+              <w:t xml:space="preserve">Huy</w:t>
             </w:r>
           </w:p>
           <w:p>

</xml_diff>